<commit_message>
§11.4 báo cáo định kỳ: danh sách hộ vướng mắc kèm bước đang thực hiện, số ngày tồn đọng (Word, Excel, màn Báo cáo); chọn, tải về sửa, thay, thêm, xóa mẫu báo cáo; nút báo cáo định kỳ một lần bấm
Co-Authored-By: Claude Opus 5.5 <noreply@anthropic.com>
Claude-Session: https://claude.ai/code/session_01RdJLzREKA3UHEEm2FC8soH
</commit_message>
<xml_diff>
--- a/apps/desktop/public/mau-van-ban/bao-cao-tong-hop.docx
+++ b/apps/desktop/public/mau-van-ban/bao-cao-tong-hop.docx
@@ -1267,6 +1267,97 @@
           <w:szCs w:val="26"/>
         </w:rPr>
         <w:t xml:space="preserve">{/vuong_mac}</w:t>
+      </w:r>
+    </w:p>
+    <w:p>
+      <w:pPr>
+        <w:spacing w:after="80" w:before="0" w:line="300"/>
+        <w:ind w:firstLine="567"/>
+        <w:jc w:val="both"/>
+      </w:pPr>
+      <w:r>
+        <w:rPr>
+          <w:rFonts w:ascii="Times New Roman" w:cs="Times New Roman" w:eastAsia="Times New Roman" w:hAnsi="Times New Roman"/>
+          <w:sz w:val="26"/>
+          <w:szCs w:val="26"/>
+        </w:rPr>
+        <w:t xml:space="preserve">{#co_ho_vuong_mac}</w:t>
+      </w:r>
+    </w:p>
+    <w:p>
+      <w:pPr>
+        <w:spacing w:after="80" w:before="0" w:line="300"/>
+        <w:ind w:firstLine="567"/>
+        <w:jc w:val="both"/>
+      </w:pPr>
+      <w:r>
+        <w:rPr>
+          <w:rFonts w:ascii="Times New Roman" w:cs="Times New Roman" w:eastAsia="Times New Roman" w:hAnsi="Times New Roman"/>
+          <w:i/>
+          <w:sz w:val="26"/>
+          <w:szCs w:val="26"/>
+        </w:rPr>
+        <w:t xml:space="preserve">Danh sách hộ, cá nhân, tổ chức đang vướng mắc (bước đang thực hiện, số ngày tồn đọng):</w:t>
+      </w:r>
+    </w:p>
+    <w:p>
+      <w:pPr>
+        <w:spacing w:after="80" w:before="0" w:line="300"/>
+        <w:ind w:firstLine="567"/>
+        <w:jc w:val="both"/>
+      </w:pPr>
+      <w:r>
+        <w:rPr>
+          <w:rFonts w:ascii="Times New Roman" w:cs="Times New Roman" w:eastAsia="Times New Roman" w:hAnsi="Times New Roman"/>
+          <w:sz w:val="26"/>
+          <w:szCs w:val="26"/>
+        </w:rPr>
+        <w:t xml:space="preserve">{#ho_vuong_mac}</w:t>
+      </w:r>
+    </w:p>
+    <w:p>
+      <w:pPr>
+        <w:spacing w:after="80" w:before="0" w:line="300"/>
+        <w:ind w:firstLine="567"/>
+        <w:jc w:val="both"/>
+      </w:pPr>
+      <w:r>
+        <w:rPr>
+          <w:rFonts w:ascii="Times New Roman" w:cs="Times New Roman" w:eastAsia="Times New Roman" w:hAnsi="Times New Roman"/>
+          <w:sz w:val="26"/>
+          <w:szCs w:val="26"/>
+        </w:rPr>
+        <w:t xml:space="preserve">- {du_an} – {ma} {ten}: {noi_dung} (bước {buoc}; tồn đọng {so_ngay} ngày).</w:t>
+      </w:r>
+    </w:p>
+    <w:p>
+      <w:pPr>
+        <w:spacing w:after="80" w:before="0" w:line="300"/>
+        <w:ind w:firstLine="567"/>
+        <w:jc w:val="both"/>
+      </w:pPr>
+      <w:r>
+        <w:rPr>
+          <w:rFonts w:ascii="Times New Roman" w:cs="Times New Roman" w:eastAsia="Times New Roman" w:hAnsi="Times New Roman"/>
+          <w:sz w:val="26"/>
+          <w:szCs w:val="26"/>
+        </w:rPr>
+        <w:t xml:space="preserve">{/ho_vuong_mac}</w:t>
+      </w:r>
+    </w:p>
+    <w:p>
+      <w:pPr>
+        <w:spacing w:after="80" w:before="0" w:line="300"/>
+        <w:ind w:firstLine="567"/>
+        <w:jc w:val="both"/>
+      </w:pPr>
+      <w:r>
+        <w:rPr>
+          <w:rFonts w:ascii="Times New Roman" w:cs="Times New Roman" w:eastAsia="Times New Roman" w:hAnsi="Times New Roman"/>
+          <w:sz w:val="26"/>
+          <w:szCs w:val="26"/>
+        </w:rPr>
+        <w:t xml:space="preserve">{/co_ho_vuong_mac}</w:t>
       </w:r>
     </w:p>
     <w:p>

</xml_diff>

<commit_message>
1.0.7 (chưa phát hành): dải bước dính khi cuộn; cột chọn danh sách hộ toàn tỉnh + Excel; dòng đợt in nghiêng báo cáo Word; điểm đo đối chiếu tọa độ biên bản kiểm đếm; lớp ranh thửa không dùng làm ranh GPMB; eslint 0 cảnh báo; dọn Hạn chế lỗi thời docs/09
Co-Authored-By: Claude Opus 5.5 <noreply@anthropic.com>
Claude-Session: https://claude.ai/code/session_01BZcswa4gE3voAhFCMjfJc5
</commit_message>
<xml_diff>
--- a/apps/desktop/public/mau-van-ban/bao-cao-tong-hop.docx
+++ b/apps/desktop/public/mau-van-ban/bao-cao-tong-hop.docx
@@ -688,7 +688,17 @@
                 <w:sz w:val="22"/>
                 <w:szCs w:val="22"/>
               </w:rPr>
-              <w:t xml:space="preserve">{ten}</w:t>
+              <w:t xml:space="preserve">{^la_dot}{ten}{/la_dot}</w:t>
+            </w:r>
+            <w:r>
+              <w:rPr>
+                <w:rFonts w:ascii="Times New Roman" w:cs="Times New Roman" w:eastAsia="Times New Roman" w:hAnsi="Times New Roman"/>
+                <w:i/>
+                <w:iCs/>
+                <w:sz w:val="22"/>
+                <w:szCs w:val="22"/>
+              </w:rPr>
+              <w:t xml:space="preserve">{#la_dot}{ten}{/la_dot}</w:t>
             </w:r>
           </w:p>
         </w:tc>

</xml_diff>